<commit_message>
Guide: explain the workflow-check line in the Lab 3 trace
Co-Authored-By: Claude Opus 5.5 <noreply@anthropic.com>
</commit_message>
<xml_diff>
--- a/docs/Huong-dan-Workshop-AI-DGX-Spark.docx
+++ b/docs/Huong-dan-Workshop-AI-DGX-Spark.docx
@@ -2375,6 +2375,63 @@
             </w:r>
             <w:r>
               <w:t xml:space="preserve">“AI quyết định cần làm gì; còn mọi con số đều do máy tính toán, nên không có chuyện bịa số.”</w:t>
+            </w:r>
+          </w:p>
+        </w:tc>
+      </w:tr>
+    </w:tbl>
+    <w:p>
+      <w:pPr>
+        <w:spacing w:after="100"/>
+      </w:pPr>
+    </w:p>
+    <w:tbl>
+      <w:tblPr>
+        <w:tblW w:type="dxa" w:w="9026"/>
+        <w:tblBorders>
+          <w:top w:val="single" w:color="auto" w:sz="4"/>
+          <w:left w:val="single" w:color="auto" w:sz="4"/>
+          <w:bottom w:val="single" w:color="auto" w:sz="4"/>
+          <w:right w:val="single" w:color="auto" w:sz="4"/>
+          <w:insideH w:val="single" w:color="auto" w:sz="4"/>
+          <w:insideV w:val="single" w:color="auto" w:sz="4"/>
+        </w:tblBorders>
+      </w:tblPr>
+      <w:tblGrid>
+        <w:gridCol w:w="9026"/>
+      </w:tblGrid>
+      <w:tr>
+        <w:tc>
+          <w:tcPr>
+            <w:tcW w:type="dxa" w:w="9026"/>
+            <w:tcBorders>
+              <w:top w:val="single" w:color="EEF3FB" w:sz="4"/>
+              <w:left w:val="single" w:color="6B8FD6" w:sz="24"/>
+              <w:bottom w:val="single" w:color="EEF3FB" w:sz="4"/>
+              <w:right w:val="single" w:color="EEF3FB" w:sz="4"/>
+            </w:tcBorders>
+            <w:shd w:fill="EEF3FB" w:color="auto" w:val="clear"/>
+            <w:tcMar>
+              <w:top w:type="dxa" w:w="120"/>
+              <w:left w:type="dxa" w:w="200"/>
+              <w:bottom w:type="dxa" w:w="100"/>
+              <w:right w:type="dxa" w:w="160"/>
+            </w:tcMar>
+          </w:tcPr>
+          <w:p>
+            <w:pPr>
+              <w:spacing w:after="60"/>
+            </w:pPr>
+            <w:r>
+              <w:rPr>
+                <w:b/>
+                <w:bCs/>
+                <w:color w:val="1F2937"/>
+              </w:rPr>
+              <w:t xml:space="preserve">NẾU THẤY DÒNG “📋 Kiểm tra quy trình”  </w:t>
+            </w:r>
+            <w:r>
+              <w:t xml:space="preserve">Đó là ứng dụng nhắc agent làm đủ các bước (biểu đồ, báo cáo) trước khi trả lời. Đây là chuyện bình thường, và là một điểm hay để giới thiệu: agent được đặt trong một quy trình có kiểm soát.</w:t>
             </w:r>
           </w:p>
         </w:tc>

</xml_diff>

<commit_message>
Guides: first start after a restart takes 1-3 minutes; how to repair
Co-Authored-By: Claude Opus 5.5 <noreply@anthropic.com>
</commit_message>
<xml_diff>
--- a/docs/Huong-dan-Workshop-AI-DGX-Spark.docx
+++ b/docs/Huong-dan-Workshop-AI-DGX-Spark.docx
@@ -58,7 +58,7 @@
           <w:sz w:val="18"/>
           <w:szCs w:val="18"/>
         </w:rPr>
-        <w:t xml:space="preserve">Cập nhật ngày 06/10/2026</w:t>
+        <w:t xml:space="preserve">Cập nhật ngày 06/10/2026 (bản 2)</w:t>
       </w:r>
     </w:p>
     <w:tbl>
@@ -1618,6 +1618,29 @@
         <w:spacing w:after="80"/>
       </w:pPr>
       <w:r>
+        <w:t xml:space="preserve">Nếu máy vừa bật lên hoặc vừa khởi động lại, lần mở đầu tiên mất </w:t>
+      </w:r>
+      <w:r>
+        <w:rPr>
+          <w:b/>
+          <w:bCs/>
+        </w:rPr>
+        <w:t xml:space="preserve">1–3 phút</w:t>
+      </w:r>
+      <w:r>
+        <w:t xml:space="preserve"> để NemoClaw khởi động. Cứ chờ, không cần làm gì.</w:t>
+      </w:r>
+    </w:p>
+    <w:p>
+      <w:pPr>
+        <w:pStyle w:val="ListParagraph"/>
+        <w:numPr>
+          <w:ilvl w:val="0"/>
+          <w:numId w:val="2"/>
+        </w:numPr>
+        <w:spacing w:after="80"/>
+      </w:pPr>
+      <w:r>
         <w:t xml:space="preserve">Giữ cửa sổ Terminal mở suốt buổi trình diễn </w:t>
       </w:r>
       <w:r>
@@ -2826,7 +2849,7 @@
           </w:tcPr>
           <w:p>
             <w:r>
-              <w:t xml:space="preserve">Bài 3 ghi “Chế độ trực tiếp”</w:t>
+              <w:t xml:space="preserve">Bài 2 hoặc 3 ghi “chế độ trực tiếp”</w:t>
             </w:r>
           </w:p>
         </w:tc>
@@ -2849,7 +2872,14 @@
           </w:tcPr>
           <w:p>
             <w:r>
-              <w:t xml:space="preserve">Vẫn trình diễn bình thường; báo người phụ trách sau buổi</w:t>
+              <w:t xml:space="preserve">Vẫn trình diễn được. Để sửa (khoảng 15 phút): đóng cửa sổ Terminal của workshop, rồi chạy lại </w:t>
+            </w:r>
+            <w:r>
+              <w:rPr>
+                <w:b/>
+                <w:bCs/>
+              </w:rPr>
+              <w:t xml:space="preserve">lệnh cài đặt ở Phần A, Bước 2</w:t>
             </w:r>
           </w:p>
         </w:tc>

</xml_diff>

<commit_message>
Model downloads reconnect by themselves when they crawl
On a new Spark, the install sat at about 20 of 21 GB of qwen3.6:35b at a
few KB/s: ollama pull often slows to a crawl on the last chunks of a large
file. Cancelling and pulling again resumes from what is on disk, and the
rest usually arrives at full speed.

scripts/pull-model.py (standard library, so it runs before the workshop's
Python environment exists) drives Ollama's pull API with a progress line,
and when the speed stays under 5% of what the download managed earlier
(and under 0.2 MB/s at least) for a minute, it drops the connection and
pulls again. Tested on the Spark: forced reconnects every 4 s resumed each
time (140, 282, 425, 567 MB of 1.4 GB), and a normal run finished and
verified the model.

Guides: what to do when a download crawls (nothing).

Co-Authored-By: Claude Opus 5.5 <noreply@anthropic.com>
</commit_message>
<xml_diff>
--- a/docs/Huong-dan-Workshop-AI-DGX-Spark.docx
+++ b/docs/Huong-dan-Workshop-AI-DGX-Spark.docx
@@ -2603,6 +2603,54 @@
                 <w:bCs/>
               </w:rPr>
               <w:t xml:space="preserve">http://127.0.0.1:8090</w:t>
+            </w:r>
+          </w:p>
+        </w:tc>
+      </w:tr>
+      <w:tr>
+        <w:tc>
+          <w:tcPr>
+            <w:tcW w:type="dxa" w:w="3600"/>
+            <w:tcBorders>
+              <w:top w:val="single" w:color="CBD5E1" w:sz="4"/>
+              <w:left w:val="single" w:color="CBD5E1" w:sz="4"/>
+              <w:bottom w:val="single" w:color="CBD5E1" w:sz="4"/>
+              <w:right w:val="single" w:color="CBD5E1" w:sz="4"/>
+            </w:tcBorders>
+            <w:tcMar>
+              <w:top w:type="dxa" w:w="90"/>
+              <w:left w:type="dxa" w:w="120"/>
+              <w:bottom w:type="dxa" w:w="90"/>
+              <w:right w:type="dxa" w:w="120"/>
+            </w:tcMar>
+            <w:vAlign w:val="center"/>
+          </w:tcPr>
+          <w:p>
+            <w:r>
+              <w:t xml:space="preserve">Lúc tải mô hình, tốc độ tụt còn vài KB/s</w:t>
+            </w:r>
+          </w:p>
+        </w:tc>
+        <w:tc>
+          <w:tcPr>
+            <w:tcW w:type="dxa" w:w="5426"/>
+            <w:tcBorders>
+              <w:top w:val="single" w:color="CBD5E1" w:sz="4"/>
+              <w:left w:val="single" w:color="CBD5E1" w:sz="4"/>
+              <w:bottom w:val="single" w:color="CBD5E1" w:sz="4"/>
+              <w:right w:val="single" w:color="CBD5E1" w:sz="4"/>
+            </w:tcBorders>
+            <w:tcMar>
+              <w:top w:type="dxa" w:w="90"/>
+              <w:left w:type="dxa" w:w="120"/>
+              <w:bottom w:type="dxa" w:w="90"/>
+              <w:right w:type="dxa" w:w="120"/>
+            </w:tcMar>
+            <w:vAlign w:val="center"/>
+          </w:tcPr>
+          <w:p>
+            <w:r>
+              <w:t xml:space="preserve">Không cần làm gì: sau khoảng 1 phút chương trình tự kết nối lại và tải tiếp, phần đã tải được giữ nguyên</w:t>
             </w:r>
           </w:p>
         </w:tc>

</xml_diff>

<commit_message>
Docs: OpenClaw challenge, model switching, comparisons, offline restarts
README (labs, setup steps, settings, "Without internet", what was verified on
7 October and what was not), START-HERE and the Word guide (new section on
the OpenClaw challenge and switching to Qwen, the before/after columns, no
internet needed after setup).

Co-Authored-By: Claude Opus 5.5 <noreply@anthropic.com>
</commit_message>
<xml_diff>
--- a/docs/Huong-dan-Workshop-AI-DGX-Spark.docx
+++ b/docs/Huong-dan-Workshop-AI-DGX-Spark.docx
@@ -58,7 +58,7 @@
           <w:sz w:val="18"/>
           <w:szCs w:val="18"/>
         </w:rPr>
-        <w:t xml:space="preserve">Cập nhật ngày 06/10/2026 (bản 2)</w:t>
+        <w:t xml:space="preserve">Cập nhật ngày 07/10/2026 (bản 3)</w:t>
       </w:r>
     </w:p>
     <w:tbl>
@@ -111,7 +111,7 @@
                 <w:b/>
                 <w:bCs/>
               </w:rPr>
-              <w:t xml:space="preserve">Lần đầu (cài đặt, khoảng 1–1,5 giờ): </w:t>
+              <w:t xml:space="preserve">Lần đầu (cài đặt, khoảng 1–2 giờ, cần internet): </w:t>
             </w:r>
             <w:r>
               <w:t xml:space="preserve">mở Terminal → dán 1 lệnh duy nhất → nhấn Enter, nhập mật khẩu → chờ máy tự chạy.</w:t>
@@ -129,7 +129,7 @@
               <w:t xml:space="preserve">Những lần sau: </w:t>
             </w:r>
             <w:r>
-              <w:t xml:space="preserve">bấm đúp biểu tượng “DGX Spark Workshop” trên màn hình nền.</w:t>
+              <w:t xml:space="preserve">bấm đúp biểu tượng “DGX Spark Workshop” trên màn hình nền. Không cần internet, kể cả sau khi khởi động lại máy.</w:t>
             </w:r>
           </w:p>
           <w:p>
@@ -505,7 +505,105 @@
           </w:p>
         </w:tc>
       </w:tr>
+      <w:tr>
+        <w:tc>
+          <w:tcPr>
+            <w:tcW w:type="dxa" w:w="2500"/>
+            <w:tcBorders>
+              <w:top w:val="single" w:color="CBD5E1" w:sz="4"/>
+              <w:left w:val="single" w:color="CBD5E1" w:sz="4"/>
+              <w:bottom w:val="single" w:color="CBD5E1" w:sz="4"/>
+              <w:right w:val="single" w:color="CBD5E1" w:sz="4"/>
+            </w:tcBorders>
+            <w:tcMar>
+              <w:top w:type="dxa" w:w="90"/>
+              <w:left w:type="dxa" w:w="120"/>
+              <w:bottom w:type="dxa" w:w="90"/>
+              <w:right w:type="dxa" w:w="120"/>
+            </w:tcMar>
+            <w:vAlign w:val="center"/>
+          </w:tcPr>
+          <w:p>
+            <w:r>
+              <w:rPr>
+                <w:b/>
+                <w:bCs/>
+              </w:rPr>
+              <w:t xml:space="preserve">4 · Thử thách OpenClaw</w:t>
+            </w:r>
+          </w:p>
+        </w:tc>
+        <w:tc>
+          <w:tcPr>
+            <w:tcW w:type="dxa" w:w="3700"/>
+            <w:tcBorders>
+              <w:top w:val="single" w:color="CBD5E1" w:sz="4"/>
+              <w:left w:val="single" w:color="CBD5E1" w:sz="4"/>
+              <w:bottom w:val="single" w:color="CBD5E1" w:sz="4"/>
+              <w:right w:val="single" w:color="CBD5E1" w:sz="4"/>
+            </w:tcBorders>
+            <w:tcMar>
+              <w:top w:type="dxa" w:w="90"/>
+              <w:left w:type="dxa" w:w="120"/>
+              <w:bottom w:type="dxa" w:w="90"/>
+              <w:right w:type="dxa" w:w="120"/>
+            </w:tcMar>
+            <w:vAlign w:val="center"/>
+          </w:tcPr>
+          <w:p>
+            <w:r>
+              <w:t xml:space="preserve">Các đội tự giao việc cho agent OpenClaw và xây sản phẩm của mình (10:00–11:10)</w:t>
+            </w:r>
+          </w:p>
+        </w:tc>
+        <w:tc>
+          <w:tcPr>
+            <w:tcW w:type="dxa" w:w="2826"/>
+            <w:tcBorders>
+              <w:top w:val="single" w:color="CBD5E1" w:sz="4"/>
+              <w:left w:val="single" w:color="CBD5E1" w:sz="4"/>
+              <w:bottom w:val="single" w:color="CBD5E1" w:sz="4"/>
+              <w:right w:val="single" w:color="CBD5E1" w:sz="4"/>
+            </w:tcBorders>
+            <w:tcMar>
+              <w:top w:type="dxa" w:w="90"/>
+              <w:left w:type="dxa" w:w="120"/>
+              <w:bottom w:type="dxa" w:w="90"/>
+              <w:right w:type="dxa" w:w="120"/>
+            </w:tcMar>
+            <w:vAlign w:val="center"/>
+          </w:tcPr>
+          <w:p>
+            <w:r>
+              <w:t xml:space="preserve">Mỗi đội trình diễn sản phẩm lúc 11:10</w:t>
+            </w:r>
+          </w:p>
+        </w:tc>
+      </w:tr>
     </w:tbl>
+    <w:p>
+      <w:pPr>
+        <w:spacing w:after="60"/>
+      </w:pPr>
+    </w:p>
+    <w:p>
+      <w:pPr>
+        <w:spacing w:after="120"/>
+      </w:pPr>
+      <w:r>
+        <w:t xml:space="preserve">Bài 1, 2 và 3 đều có phần </w:t>
+      </w:r>
+      <w:r>
+        <w:rPr>
+          <w:b/>
+          <w:bCs/>
+        </w:rPr>
+        <w:t xml:space="preserve">so sánh trước / sau</w:t>
+      </w:r>
+      <w:r>
+        <w:t xml:space="preserve">: cùng một câu hỏi, đặt cạnh nhau, để khán giả thấy rõ khác biệt (trước và sau khi tinh chỉnh; không có và có RAG; chỉ có mô hình và có agent).</w:t>
+      </w:r>
+    </w:p>
     <w:p>
       <w:pPr>
         <w:spacing w:after="60"/>
@@ -561,7 +659,17 @@
         <w:t xml:space="preserve">internet</w:t>
       </w:r>
       <w:r>
-        <w:t xml:space="preserve"> (chỉ cần khi cài đặt lần đầu).</w:t>
+        <w:t xml:space="preserve"> (chỉ cần khi cài đặt). </w:t>
+      </w:r>
+      <w:r>
+        <w:rPr>
+          <w:b/>
+          <w:bCs/>
+        </w:rPr>
+        <w:t xml:space="preserve">Sau khi cài xong, workshop chạy không cần internet</w:t>
+      </w:r>
+      <w:r>
+        <w:t xml:space="preserve">, kể cả sau khi khởi động lại máy.</w:t>
       </w:r>
     </w:p>
     <w:p>
@@ -610,7 +718,7 @@
           <w:b/>
           <w:bCs/>
         </w:rPr>
-        <w:t xml:space="preserve">60 GB</w:t>
+        <w:t xml:space="preserve">100 GB</w:t>
       </w:r>
       <w:r>
         <w:t xml:space="preserve"> dung lượng trống.</w:t>
@@ -633,10 +741,10 @@
           <w:b/>
           <w:bCs/>
         </w:rPr>
-        <w:t xml:space="preserve">1–1,5 giờ</w:t>
-      </w:r>
-      <w:r>
-        <w:t xml:space="preserve"> cho lần cài đặt đầu tiên. Máy tự chạy, không cần ngồi canh.</w:t>
+        <w:t xml:space="preserve">1–2 giờ</w:t>
+      </w:r>
+      <w:r>
+        <w:t xml:space="preserve"> cho lần cài đặt đầu tiên. Máy tự chạy, không cần ngồi canh. Nếu máy thiếu phần mềm nào (Docker, Python…), chương trình tự cài.</w:t>
       </w:r>
     </w:p>
     <w:p>
@@ -1022,10 +1130,10 @@
           <w:b/>
           <w:bCs/>
         </w:rPr>
-        <w:t xml:space="preserve">45–90 phút</w:t>
-      </w:r>
-      <w:r>
-        <w:t xml:space="preserve">. Máy tự tải khoảng 60 GB (mô hình AI và phần mềm). </w:t>
+        <w:t xml:space="preserve">1–2 giờ</w:t>
+      </w:r>
+      <w:r>
+        <w:t xml:space="preserve">. Máy tự tải khoảng 85 GB (mô hình AI và phần mềm). </w:t>
       </w:r>
       <w:r>
         <w:rPr>
@@ -1618,17 +1726,24 @@
         <w:spacing w:after="80"/>
       </w:pPr>
       <w:r>
-        <w:t xml:space="preserve">Nếu máy vừa bật lên hoặc vừa khởi động lại, lần mở đầu tiên mất </w:t>
-      </w:r>
-      <w:r>
-        <w:rPr>
-          <w:b/>
-          <w:bCs/>
-        </w:rPr>
-        <w:t xml:space="preserve">1–5 phút</w:t>
-      </w:r>
-      <w:r>
-        <w:t xml:space="preserve"> để NemoClaw khởi động. Cứ chờ, không cần làm gì.</w:t>
+        <w:t xml:space="preserve">Nếu máy vừa bật lên hoặc vừa khởi động lại, lần mở đầu tiên mất khoảng </w:t>
+      </w:r>
+      <w:r>
+        <w:rPr>
+          <w:b/>
+          <w:bCs/>
+        </w:rPr>
+        <w:t xml:space="preserve">1 phút</w:t>
+      </w:r>
+      <w:r>
+        <w:t xml:space="preserve"> (tối đa 5 phút) để NemoClaw khởi động. Cứ chờ, không cần làm gì. </w:t>
+      </w:r>
+      <w:r>
+        <w:rPr>
+          <w:b/>
+          <w:bCs/>
+        </w:rPr>
+        <w:t xml:space="preserve">Không cần internet.</w:t>
       </w:r>
     </w:p>
     <w:p>
@@ -1839,7 +1954,7 @@
           </w:tcPr>
           <w:p>
             <w:r>
-              <w:t xml:space="preserve">Tổng quan · 1 · Tinh chỉnh · 2 · RAG · 3 · Agent</w:t>
+              <w:t xml:space="preserve">Tổng quan · 01 Tinh chỉnh · 02 RAG · 03 Agent · 04 OpenClaw · Thử thách</w:t>
             </w:r>
           </w:p>
         </w:tc>
@@ -1920,7 +2035,7 @@
                 <w:b/>
                 <w:bCs/>
               </w:rPr>
-              <w:t xml:space="preserve">Các chấm tròn ở góc trên</w:t>
+              <w:t xml:space="preserve">Thanh trạng thái ở góc trên</w:t>
             </w:r>
           </w:p>
         </w:tc>
@@ -1943,7 +2058,7 @@
           </w:tcPr>
           <w:p>
             <w:r>
-              <w:t xml:space="preserve">Xanh = sẵn sàng. Xám hoặc vàng = chưa sẵn sàng, nhưng vẫn trình diễn được</w:t>
+              <w:t xml:space="preserve">GPU · Ollama · NemoClaw · OpenClaw. Chấm xanh = sẵn sàng. Xám hoặc vàng = chưa sẵn sàng, nhưng vẫn trình diễn được</w:t>
             </w:r>
           </w:p>
         </w:tc>
@@ -2171,7 +2286,17 @@
         <w:spacing w:after="100"/>
       </w:pPr>
       <w:r>
-        <w:t xml:space="preserve">Bấm câu màu cam “Sau khi ngắt cầu dao DC, phải chờ bao lâu trước khi tháo nắp module?”. Kết quả: </w:t>
+        <w:t xml:space="preserve">Bấm câu có nhãn </w:t>
+      </w:r>
+      <w:r>
+        <w:rPr>
+          <w:b/>
+          <w:bCs/>
+        </w:rPr>
+        <w:t xml:space="preserve">Then chốt</w:t>
+      </w:r>
+      <w:r>
+        <w:t xml:space="preserve"> “Sau khi ngắt cầu dao DC, phải chờ bao lâu trước khi tháo nắp module?”. Kết quả: </w:t>
       </w:r>
       <w:r>
         <w:rPr>
@@ -2192,6 +2317,39 @@
       </w:r>
       <w:r>
         <w:t xml:space="preserve"> để khán giả thấy đoạn tài liệu gốc.</w:t>
+      </w:r>
+    </w:p>
+    <w:p>
+      <w:pPr>
+        <w:pStyle w:val="ListParagraph"/>
+        <w:numPr>
+          <w:ilvl w:val="0"/>
+          <w:numId w:val="5"/>
+        </w:numPr>
+        <w:spacing w:after="100"/>
+      </w:pPr>
+      <w:r>
+        <w:t xml:space="preserve">Chỉ vào hai cột của câu trả lời: </w:t>
+      </w:r>
+      <w:r>
+        <w:rPr>
+          <w:b/>
+          <w:bCs/>
+        </w:rPr>
+        <w:t xml:space="preserve">Không có RAG</w:t>
+      </w:r>
+      <w:r>
+        <w:t xml:space="preserve"> (cùng mô hình nhưng không có tài liệu, thường trả lời sai hoặc bịa, ví dụ tủ AX-600 chứa “1000 lít”) và </w:t>
+      </w:r>
+      <w:r>
+        <w:rPr>
+          <w:b/>
+          <w:bCs/>
+        </w:rPr>
+        <w:t xml:space="preserve">Có RAG</w:t>
+      </w:r>
+      <w:r>
+        <w:t xml:space="preserve"> (đúng theo tài liệu, kèm nguồn).</w:t>
       </w:r>
     </w:p>
     <w:p>
@@ -2292,7 +2450,17 @@
         <w:t xml:space="preserve">3 · Agent</w:t>
       </w:r>
       <w:r>
-        <w:t xml:space="preserve">. Bấm câu màu cam “Phân tích doanh số theo vùng và cho biết khu vực nào tăng trưởng tốt nhất.”</w:t>
+        <w:t xml:space="preserve">. Bấm câu có nhãn </w:t>
+      </w:r>
+      <w:r>
+        <w:rPr>
+          <w:b/>
+          <w:bCs/>
+        </w:rPr>
+        <w:t xml:space="preserve">Then chốt</w:t>
+      </w:r>
+      <w:r>
+        <w:t xml:space="preserve"> “Phân tích doanh số theo vùng và cho biết khu vực nào tăng trưởng tốt nhất.”</w:t>
       </w:r>
     </w:p>
     <w:p>
@@ -2349,6 +2517,49 @@
       </w:r>
       <w:r>
         <w:t xml:space="preserve"> để mở báo cáo vừa tạo.</w:t>
+      </w:r>
+    </w:p>
+    <w:p>
+      <w:pPr>
+        <w:pStyle w:val="ListParagraph"/>
+        <w:numPr>
+          <w:ilvl w:val="0"/>
+          <w:numId w:val="6"/>
+        </w:numPr>
+        <w:spacing w:after="100"/>
+      </w:pPr>
+      <w:r>
+        <w:t xml:space="preserve">Ô </w:t>
+      </w:r>
+      <w:r>
+        <w:rPr>
+          <w:b/>
+          <w:bCs/>
+        </w:rPr>
+        <w:t xml:space="preserve">Nhận định</w:t>
+      </w:r>
+      <w:r>
+        <w:t xml:space="preserve"> đặt hai cột cạnh nhau: </w:t>
+      </w:r>
+      <w:r>
+        <w:rPr>
+          <w:b/>
+          <w:bCs/>
+        </w:rPr>
+        <w:t xml:space="preserve">Chỉ có mô hình</w:t>
+      </w:r>
+      <w:r>
+        <w:t xml:space="preserve"> (không mở được file Excel nên chỉ đoán hoặc xin dữ liệu) và </w:t>
+      </w:r>
+      <w:r>
+        <w:rPr>
+          <w:b/>
+          <w:bCs/>
+        </w:rPr>
+        <w:t xml:space="preserve">Agent + công cụ</w:t>
+      </w:r>
+      <w:r>
+        <w:t xml:space="preserve"> (số liệu thật, tính bằng Python).</w:t>
       </w:r>
     </w:p>
     <w:tbl>
@@ -2451,7 +2662,7 @@
                 <w:bCs/>
                 <w:color w:val="1F2937"/>
               </w:rPr>
-              <w:t xml:space="preserve">NẾU THẤY DÒNG “📋 Kiểm tra quy trình”  </w:t>
+              <w:t xml:space="preserve">NẾU THẤY DÒNG “Kiểm tra quy trình”  </w:t>
             </w:r>
             <w:r>
               <w:t xml:space="preserve">Đó là ứng dụng nhắc agent làm đủ các bước (biểu đồ, báo cáo) trước khi trả lời. Đây là chuyện bình thường, và là một điểm hay để giới thiệu: agent được đặt trong một quy trình có kiểm soát.</w:t>
@@ -2470,7 +2681,317 @@
         <w:pStyle w:val="Heading1"/>
       </w:pPr>
       <w:r>
-        <w:t xml:space="preserve">6. Phần D — Khi gặp sự cố</w:t>
+        <w:t xml:space="preserve">6. Phần D — Thử thách OpenClaw (10:00 – 11:10)</w:t>
+      </w:r>
+    </w:p>
+    <w:p>
+      <w:pPr>
+        <w:spacing w:after="120"/>
+      </w:pPr>
+      <w:r>
+        <w:t xml:space="preserve">OpenClaw là agent AI chạy trong sandbox NemoClaw của chính máy này. Trong phần thử thách, mỗi đội tự giao việc cho agent bằng ngôn ngữ thường ngày, rồi biến cách làm hiệu quả thành skill để trình diễn lúc 11:10.</w:t>
+      </w:r>
+    </w:p>
+    <w:p>
+      <w:pPr>
+        <w:pStyle w:val="ListParagraph"/>
+        <w:numPr>
+          <w:ilvl w:val="0"/>
+          <w:numId w:val="7"/>
+        </w:numPr>
+        <w:spacing w:after="100"/>
+      </w:pPr>
+      <w:r>
+        <w:t xml:space="preserve">Mở tab </w:t>
+      </w:r>
+      <w:r>
+        <w:rPr>
+          <w:b/>
+          <w:bCs/>
+        </w:rPr>
+        <w:t xml:space="preserve">04 OpenClaw · Thử thách</w:t>
+      </w:r>
+      <w:r>
+        <w:t xml:space="preserve"> rồi bấm nút xanh </w:t>
+      </w:r>
+      <w:r>
+        <w:rPr>
+          <w:b/>
+          <w:bCs/>
+        </w:rPr>
+        <w:t xml:space="preserve">Mở OpenClaw</w:t>
+      </w:r>
+      <w:r>
+        <w:t xml:space="preserve">. Hoặc gõ </w:t>
+      </w:r>
+      <w:r>
+        <w:rPr>
+          <w:b/>
+          <w:bCs/>
+        </w:rPr>
+        <w:t xml:space="preserve">localhost:8090/openclaw</w:t>
+      </w:r>
+      <w:r>
+        <w:t xml:space="preserve"> vào thanh địa chỉ. OpenClaw mở ra ở trang Chat.</w:t>
+      </w:r>
+    </w:p>
+    <w:p>
+      <w:pPr>
+        <w:pStyle w:val="ListParagraph"/>
+        <w:numPr>
+          <w:ilvl w:val="0"/>
+          <w:numId w:val="7"/>
+        </w:numPr>
+        <w:spacing w:after="100"/>
+      </w:pPr>
+      <w:r>
+        <w:t xml:space="preserve">Giao việc cho agent: nói rõ cần làm gì, dùng dữ liệu nào, muốn nhận lại gì. Viết tiếng Việt được.</w:t>
+      </w:r>
+    </w:p>
+    <w:p>
+      <w:pPr>
+        <w:pStyle w:val="ListParagraph"/>
+        <w:numPr>
+          <w:ilvl w:val="0"/>
+          <w:numId w:val="7"/>
+        </w:numPr>
+        <w:spacing w:after="100"/>
+      </w:pPr>
+      <w:r>
+        <w:t xml:space="preserve">Muốn có sẵn ý tưởng: ở tab 04 có 4 </w:t>
+      </w:r>
+      <w:r>
+        <w:rPr>
+          <w:b/>
+          <w:bCs/>
+        </w:rPr>
+        <w:t xml:space="preserve">ý tưởng khởi đầu</w:t>
+      </w:r>
+      <w:r>
+        <w:t xml:space="preserve">. Bấm </w:t>
+      </w:r>
+      <w:r>
+        <w:rPr>
+          <w:b/>
+          <w:bCs/>
+        </w:rPr>
+        <w:t xml:space="preserve">Sao chép</w:t>
+      </w:r>
+      <w:r>
+        <w:t xml:space="preserve"> rồi dán vào khung chat của OpenClaw.</w:t>
+      </w:r>
+    </w:p>
+    <w:p>
+      <w:pPr>
+        <w:pStyle w:val="ListParagraph"/>
+        <w:numPr>
+          <w:ilvl w:val="0"/>
+          <w:numId w:val="7"/>
+        </w:numPr>
+        <w:spacing w:after="100"/>
+      </w:pPr>
+      <w:r>
+        <w:t xml:space="preserve">Yêu cầu agent lưu cách làm thành skill, rồi thử lại trong một cuộc chat mới.</w:t>
+      </w:r>
+    </w:p>
+    <w:p>
+      <w:pPr>
+        <w:pStyle w:val="Heading3"/>
+      </w:pPr>
+      <w:r>
+        <w:t xml:space="preserve">Đổi mô hình (tuỳ chọn)</w:t>
+      </w:r>
+    </w:p>
+    <w:p>
+      <w:pPr>
+        <w:spacing w:after="120"/>
+      </w:pPr>
+      <w:r>
+        <w:t xml:space="preserve">Mặc định là </w:t>
+      </w:r>
+      <w:r>
+        <w:rPr>
+          <w:b/>
+          <w:bCs/>
+        </w:rPr>
+        <w:t xml:space="preserve">Nemotron 3.5 Lightning</w:t>
+      </w:r>
+      <w:r>
+        <w:t xml:space="preserve">. Nếu câu trả lời chưa đủ tốt, các đội có thể thử </w:t>
+      </w:r>
+      <w:r>
+        <w:rPr>
+          <w:b/>
+          <w:bCs/>
+        </w:rPr>
+        <w:t xml:space="preserve">Qwen 3.6</w:t>
+      </w:r>
+      <w:r>
+        <w:t xml:space="preserve">:</w:t>
+      </w:r>
+    </w:p>
+    <w:p>
+      <w:pPr>
+        <w:pStyle w:val="ListParagraph"/>
+        <w:numPr>
+          <w:ilvl w:val="0"/>
+          <w:numId w:val="2"/>
+        </w:numPr>
+        <w:spacing w:after="80"/>
+      </w:pPr>
+      <w:r>
+        <w:t xml:space="preserve">Bấm vào tên mô hình ngay dưới ô nhập tin nhắn (đang ghi “nemotron · Off”) → chọn </w:t>
+      </w:r>
+      <w:r>
+        <w:rPr>
+          <w:b/>
+          <w:bCs/>
+        </w:rPr>
+        <w:t xml:space="preserve">Workshop Ollama</w:t>
+      </w:r>
+      <w:r>
+        <w:t xml:space="preserve"> → </w:t>
+      </w:r>
+      <w:r>
+        <w:rPr>
+          <w:b/>
+          <w:bCs/>
+        </w:rPr>
+        <w:t xml:space="preserve">qwen</w:t>
+      </w:r>
+      <w:r>
+        <w:t xml:space="preserve"> → bấm </w:t>
+      </w:r>
+      <w:r>
+        <w:rPr>
+          <w:b/>
+          <w:bCs/>
+        </w:rPr>
+        <w:t xml:space="preserve">Save</w:t>
+      </w:r>
+      <w:r>
+        <w:t xml:space="preserve">.</w:t>
+      </w:r>
+    </w:p>
+    <w:p>
+      <w:pPr>
+        <w:pStyle w:val="ListParagraph"/>
+        <w:numPr>
+          <w:ilvl w:val="0"/>
+          <w:numId w:val="2"/>
+        </w:numPr>
+        <w:spacing w:after="80"/>
+      </w:pPr>
+      <w:r>
+        <w:t xml:space="preserve">Hoặc gõ </w:t>
+      </w:r>
+      <w:r>
+        <w:rPr>
+          <w:b/>
+          <w:bCs/>
+        </w:rPr>
+        <w:t xml:space="preserve">/model qwen</w:t>
+      </w:r>
+      <w:r>
+        <w:t xml:space="preserve"> vào khung chat rồi nhấn Enter. Quay lại bằng </w:t>
+      </w:r>
+      <w:r>
+        <w:rPr>
+          <w:b/>
+          <w:bCs/>
+        </w:rPr>
+        <w:t xml:space="preserve">/model nemotron</w:t>
+      </w:r>
+      <w:r>
+        <w:t xml:space="preserve">.</w:t>
+      </w:r>
+    </w:p>
+    <w:p>
+      <w:pPr>
+        <w:pStyle w:val="ListParagraph"/>
+        <w:numPr>
+          <w:ilvl w:val="0"/>
+          <w:numId w:val="2"/>
+        </w:numPr>
+        <w:spacing w:after="80"/>
+      </w:pPr>
+      <w:r>
+        <w:t xml:space="preserve">Mỗi cuộc chat giữ mô hình riêng. Các bài 1–3 luôn dùng Nemotron.</w:t>
+      </w:r>
+    </w:p>
+    <w:tbl>
+      <w:tblPr>
+        <w:tblW w:type="dxa" w:w="9026"/>
+        <w:tblBorders>
+          <w:top w:val="single" w:color="auto" w:sz="4"/>
+          <w:left w:val="single" w:color="auto" w:sz="4"/>
+          <w:bottom w:val="single" w:color="auto" w:sz="4"/>
+          <w:right w:val="single" w:color="auto" w:sz="4"/>
+          <w:insideH w:val="single" w:color="auto" w:sz="4"/>
+          <w:insideV w:val="single" w:color="auto" w:sz="4"/>
+        </w:tblBorders>
+      </w:tblPr>
+      <w:tblGrid>
+        <w:gridCol w:w="9026"/>
+      </w:tblGrid>
+      <w:tr>
+        <w:tc>
+          <w:tcPr>
+            <w:tcW w:type="dxa" w:w="9026"/>
+            <w:tcBorders>
+              <w:top w:val="single" w:color="EEF7E4" w:sz="4"/>
+              <w:left w:val="single" w:color="76B900" w:sz="24"/>
+              <w:bottom w:val="single" w:color="EEF7E4" w:sz="4"/>
+              <w:right w:val="single" w:color="EEF7E4" w:sz="4"/>
+            </w:tcBorders>
+            <w:shd w:fill="EEF7E4" w:color="auto" w:val="clear"/>
+            <w:tcMar>
+              <w:top w:type="dxa" w:w="120"/>
+              <w:left w:type="dxa" w:w="200"/>
+              <w:bottom w:type="dxa" w:w="100"/>
+              <w:right w:type="dxa" w:w="160"/>
+            </w:tcMar>
+          </w:tcPr>
+          <w:p>
+            <w:pPr>
+              <w:spacing w:after="60"/>
+            </w:pPr>
+            <w:r>
+              <w:rPr>
+                <w:b/>
+                <w:bCs/>
+                <w:color w:val="1F2937"/>
+              </w:rPr>
+              <w:t xml:space="preserve">MẸO CHO CÁC ĐỘI  </w:t>
+            </w:r>
+            <w:r>
+              <w:t xml:space="preserve">Gõ </w:t>
+            </w:r>
+            <w:r>
+              <w:rPr>
+                <w:b/>
+                <w:bCs/>
+              </w:rPr>
+              <w:t xml:space="preserve">/new</w:t>
+            </w:r>
+            <w:r>
+              <w:t xml:space="preserve"> để bắt đầu cuộc chat mới khi đổi ý tưởng. Nếu agent dừng giữa chừng, trả lời “tiếp tục”. Hỏi “bạn đã tạo những file nào?” để tìm kết quả.</w:t>
+            </w:r>
+          </w:p>
+        </w:tc>
+      </w:tr>
+    </w:tbl>
+    <w:p>
+      <w:pPr>
+        <w:spacing w:after="200"/>
+      </w:pPr>
+    </w:p>
+    <w:p>
+      <w:pPr>
+        <w:pStyle w:val="Heading1"/>
+      </w:pPr>
+      <w:r>
+        <w:t xml:space="preserve">7. Phần E — Khi gặp sự cố</w:t>
       </w:r>
     </w:p>
     <w:tbl>
@@ -3000,6 +3521,160 @@
           </w:tcPr>
           <w:p>
             <w:r>
+              <w:t xml:space="preserve">Máy vừa khởi động lại, không có internet</w:t>
+            </w:r>
+          </w:p>
+        </w:tc>
+        <w:tc>
+          <w:tcPr>
+            <w:tcW w:type="dxa" w:w="5426"/>
+            <w:tcBorders>
+              <w:top w:val="single" w:color="CBD5E1" w:sz="4"/>
+              <w:left w:val="single" w:color="CBD5E1" w:sz="4"/>
+              <w:bottom w:val="single" w:color="CBD5E1" w:sz="4"/>
+              <w:right w:val="single" w:color="CBD5E1" w:sz="4"/>
+            </w:tcBorders>
+            <w:tcMar>
+              <w:top w:type="dxa" w:w="90"/>
+              <w:left w:type="dxa" w:w="120"/>
+              <w:bottom w:type="dxa" w:w="90"/>
+              <w:right w:type="dxa" w:w="120"/>
+            </w:tcMar>
+            <w:vAlign w:val="center"/>
+          </w:tcPr>
+          <w:p>
+            <w:r>
+              <w:t xml:space="preserve">Bình thường: mở workshop bằng biểu tượng trên màn hình nền và chờ khoảng 1 phút. Mọi thứ chạy không cần internet</w:t>
+            </w:r>
+          </w:p>
+        </w:tc>
+      </w:tr>
+      <w:tr>
+        <w:tc>
+          <w:tcPr>
+            <w:tcW w:type="dxa" w:w="3600"/>
+            <w:tcBorders>
+              <w:top w:val="single" w:color="CBD5E1" w:sz="4"/>
+              <w:left w:val="single" w:color="CBD5E1" w:sz="4"/>
+              <w:bottom w:val="single" w:color="CBD5E1" w:sz="4"/>
+              <w:right w:val="single" w:color="CBD5E1" w:sz="4"/>
+            </w:tcBorders>
+            <w:tcMar>
+              <w:top w:type="dxa" w:w="90"/>
+              <w:left w:type="dxa" w:w="120"/>
+              <w:bottom w:type="dxa" w:w="90"/>
+              <w:right w:type="dxa" w:w="120"/>
+            </w:tcMar>
+            <w:vAlign w:val="center"/>
+          </w:tcPr>
+          <w:p>
+            <w:r>
+              <w:t xml:space="preserve">Bấm “Mở OpenClaw” mà không mở được</w:t>
+            </w:r>
+          </w:p>
+        </w:tc>
+        <w:tc>
+          <w:tcPr>
+            <w:tcW w:type="dxa" w:w="5426"/>
+            <w:tcBorders>
+              <w:top w:val="single" w:color="CBD5E1" w:sz="4"/>
+              <w:left w:val="single" w:color="CBD5E1" w:sz="4"/>
+              <w:bottom w:val="single" w:color="CBD5E1" w:sz="4"/>
+              <w:right w:val="single" w:color="CBD5E1" w:sz="4"/>
+            </w:tcBorders>
+            <w:tcMar>
+              <w:top w:type="dxa" w:w="90"/>
+              <w:left w:type="dxa" w:w="120"/>
+              <w:bottom w:type="dxa" w:w="90"/>
+              <w:right w:type="dxa" w:w="120"/>
+            </w:tcMar>
+            <w:vAlign w:val="center"/>
+          </w:tcPr>
+          <w:p>
+            <w:r>
+              <w:t xml:space="preserve">Mở trên trình duyệt của chính máy Spark (không phải từ laptop khác). Nếu vẫn không được, chờ 1 phút rồi bấm lại</w:t>
+            </w:r>
+          </w:p>
+        </w:tc>
+      </w:tr>
+      <w:tr>
+        <w:tc>
+          <w:tcPr>
+            <w:tcW w:type="dxa" w:w="3600"/>
+            <w:tcBorders>
+              <w:top w:val="single" w:color="CBD5E1" w:sz="4"/>
+              <w:left w:val="single" w:color="CBD5E1" w:sz="4"/>
+              <w:bottom w:val="single" w:color="CBD5E1" w:sz="4"/>
+              <w:right w:val="single" w:color="CBD5E1" w:sz="4"/>
+            </w:tcBorders>
+            <w:tcMar>
+              <w:top w:type="dxa" w:w="90"/>
+              <w:left w:type="dxa" w:w="120"/>
+              <w:bottom w:type="dxa" w:w="90"/>
+              <w:right w:type="dxa" w:w="120"/>
+            </w:tcMar>
+            <w:vAlign w:val="center"/>
+          </w:tcPr>
+          <w:p>
+            <w:r>
+              <w:t xml:space="preserve">Agent OpenClaw dừng giữa chừng</w:t>
+            </w:r>
+          </w:p>
+        </w:tc>
+        <w:tc>
+          <w:tcPr>
+            <w:tcW w:type="dxa" w:w="5426"/>
+            <w:tcBorders>
+              <w:top w:val="single" w:color="CBD5E1" w:sz="4"/>
+              <w:left w:val="single" w:color="CBD5E1" w:sz="4"/>
+              <w:bottom w:val="single" w:color="CBD5E1" w:sz="4"/>
+              <w:right w:val="single" w:color="CBD5E1" w:sz="4"/>
+            </w:tcBorders>
+            <w:tcMar>
+              <w:top w:type="dxa" w:w="90"/>
+              <w:left w:type="dxa" w:w="120"/>
+              <w:bottom w:type="dxa" w:w="90"/>
+              <w:right w:type="dxa" w:w="120"/>
+            </w:tcMar>
+            <w:vAlign w:val="center"/>
+          </w:tcPr>
+          <w:p>
+            <w:r>
+              <w:t xml:space="preserve">Trả lời “tiếp tục” trong khung chat, hoặc gõ </w:t>
+            </w:r>
+            <w:r>
+              <w:rPr>
+                <w:b/>
+                <w:bCs/>
+              </w:rPr>
+              <w:t xml:space="preserve">/new</w:t>
+            </w:r>
+            <w:r>
+              <w:t xml:space="preserve"> để bắt đầu lại</w:t>
+            </w:r>
+          </w:p>
+        </w:tc>
+      </w:tr>
+      <w:tr>
+        <w:tc>
+          <w:tcPr>
+            <w:tcW w:type="dxa" w:w="3600"/>
+            <w:tcBorders>
+              <w:top w:val="single" w:color="CBD5E1" w:sz="4"/>
+              <w:left w:val="single" w:color="CBD5E1" w:sz="4"/>
+              <w:bottom w:val="single" w:color="CBD5E1" w:sz="4"/>
+              <w:right w:val="single" w:color="CBD5E1" w:sz="4"/>
+            </w:tcBorders>
+            <w:tcMar>
+              <w:top w:type="dxa" w:w="90"/>
+              <w:left w:type="dxa" w:w="120"/>
+              <w:bottom w:type="dxa" w:w="90"/>
+              <w:right w:type="dxa" w:w="120"/>
+            </w:tcMar>
+            <w:vAlign w:val="center"/>
+          </w:tcPr>
+          <w:p>
+            <w:r>
               <w:t xml:space="preserve">Vẫn không được</w:t>
             </w:r>
           </w:p>
@@ -3049,7 +3724,7 @@
         <w:pStyle w:val="Heading1"/>
       </w:pPr>
       <w:r>
-        <w:t xml:space="preserve">7. Phần E — Giải thích thuật ngữ</w:t>
+        <w:t xml:space="preserve">8. Phần F — Giải thích thuật ngữ</w:t>
       </w:r>
     </w:p>
     <w:tbl>
@@ -3495,6 +4170,110 @@
           </w:p>
         </w:tc>
       </w:tr>
+      <w:tr>
+        <w:tc>
+          <w:tcPr>
+            <w:tcW w:type="dxa" w:w="2600"/>
+            <w:tcBorders>
+              <w:top w:val="single" w:color="CBD5E1" w:sz="4"/>
+              <w:left w:val="single" w:color="CBD5E1" w:sz="4"/>
+              <w:bottom w:val="single" w:color="CBD5E1" w:sz="4"/>
+              <w:right w:val="single" w:color="CBD5E1" w:sz="4"/>
+            </w:tcBorders>
+            <w:tcMar>
+              <w:top w:type="dxa" w:w="90"/>
+              <w:left w:type="dxa" w:w="120"/>
+              <w:bottom w:type="dxa" w:w="90"/>
+              <w:right w:type="dxa" w:w="120"/>
+            </w:tcMar>
+            <w:vAlign w:val="center"/>
+          </w:tcPr>
+          <w:p>
+            <w:r>
+              <w:rPr>
+                <w:b/>
+                <w:bCs/>
+              </w:rPr>
+              <w:t xml:space="preserve">OpenClaw</w:t>
+            </w:r>
+          </w:p>
+        </w:tc>
+        <w:tc>
+          <w:tcPr>
+            <w:tcW w:type="dxa" w:w="6426"/>
+            <w:tcBorders>
+              <w:top w:val="single" w:color="CBD5E1" w:sz="4"/>
+              <w:left w:val="single" w:color="CBD5E1" w:sz="4"/>
+              <w:bottom w:val="single" w:color="CBD5E1" w:sz="4"/>
+              <w:right w:val="single" w:color="CBD5E1" w:sz="4"/>
+            </w:tcBorders>
+            <w:tcMar>
+              <w:top w:type="dxa" w:w="90"/>
+              <w:left w:type="dxa" w:w="120"/>
+              <w:bottom w:type="dxa" w:w="90"/>
+              <w:right w:type="dxa" w:w="120"/>
+            </w:tcMar>
+            <w:vAlign w:val="center"/>
+          </w:tcPr>
+          <w:p>
+            <w:r>
+              <w:t xml:space="preserve">Agent AI có giao diện chat riêng, chạy trong sandbox NemoClaw. Dùng trong phần thử thách.</w:t>
+            </w:r>
+          </w:p>
+        </w:tc>
+      </w:tr>
+      <w:tr>
+        <w:tc>
+          <w:tcPr>
+            <w:tcW w:type="dxa" w:w="2600"/>
+            <w:tcBorders>
+              <w:top w:val="single" w:color="CBD5E1" w:sz="4"/>
+              <w:left w:val="single" w:color="CBD5E1" w:sz="4"/>
+              <w:bottom w:val="single" w:color="CBD5E1" w:sz="4"/>
+              <w:right w:val="single" w:color="CBD5E1" w:sz="4"/>
+            </w:tcBorders>
+            <w:tcMar>
+              <w:top w:type="dxa" w:w="90"/>
+              <w:left w:type="dxa" w:w="120"/>
+              <w:bottom w:type="dxa" w:w="90"/>
+              <w:right w:type="dxa" w:w="120"/>
+            </w:tcMar>
+            <w:vAlign w:val="center"/>
+          </w:tcPr>
+          <w:p>
+            <w:r>
+              <w:rPr>
+                <w:b/>
+                <w:bCs/>
+              </w:rPr>
+              <w:t xml:space="preserve">Skill</w:t>
+            </w:r>
+          </w:p>
+        </w:tc>
+        <w:tc>
+          <w:tcPr>
+            <w:tcW w:type="dxa" w:w="6426"/>
+            <w:tcBorders>
+              <w:top w:val="single" w:color="CBD5E1" w:sz="4"/>
+              <w:left w:val="single" w:color="CBD5E1" w:sz="4"/>
+              <w:bottom w:val="single" w:color="CBD5E1" w:sz="4"/>
+              <w:right w:val="single" w:color="CBD5E1" w:sz="4"/>
+            </w:tcBorders>
+            <w:tcMar>
+              <w:top w:type="dxa" w:w="90"/>
+              <w:left w:type="dxa" w:w="120"/>
+              <w:bottom w:type="dxa" w:w="90"/>
+              <w:right w:type="dxa" w:w="120"/>
+            </w:tcMar>
+            <w:vAlign w:val="center"/>
+          </w:tcPr>
+          <w:p>
+            <w:r>
+              <w:t xml:space="preserve">Một “kỹ năng” được lưu lại cho agent: hướng dẫn và công cụ để làm lại một việc mỗi khi được hỏi.</w:t>
+            </w:r>
+          </w:p>
+        </w:tc>
+      </w:tr>
     </w:tbl>
     <w:p>
       <w:pPr>
@@ -3506,7 +4285,7 @@
         <w:pStyle w:val="Heading1"/>
       </w:pPr>
       <w:r>
-        <w:t xml:space="preserve">8. Phụ lục — Trình chiếu từ laptop (cho người có kinh nghiệm)</w:t>
+        <w:t xml:space="preserve">9. Phụ lục — Trình chiếu từ laptop (cho người có kinh nghiệm)</w:t>
       </w:r>
     </w:p>
     <w:p>
@@ -3624,6 +4403,23 @@
         </w:tc>
       </w:tr>
     </w:tbl>
+    <w:p>
+      <w:pPr>
+        <w:spacing w:after="80"/>
+      </w:pPr>
+    </w:p>
+    <w:p>
+      <w:pPr>
+        <w:spacing w:after="120"/>
+      </w:pPr>
+      <w:r>
+        <w:rPr>
+          <w:i/>
+          <w:iCs/>
+        </w:rPr>
+        <w:t xml:space="preserve">Lưu ý: nút “Mở OpenClaw” chỉ hoạt động trên trình duyệt của chính máy Spark, vì để an toàn OpenClaw chỉ nhận kết nối từ máy đó.</w:t>
+      </w:r>
+    </w:p>
     <w:sectPr>
       <w:footerReference w:type="default" r:id="rId6"/>
       <w:pgSz w:w="11906" w:h="16838" w:orient="portrait"/>
@@ -3903,6 +4699,18 @@
       </w:pPr>
     </w:lvl>
   </w:abstractNum>
+  <w:abstractNum w:abstractNumId="7" w15:restartNumberingAfterBreak="0">
+    <w:multiLevelType w:val="hybridMultilevel"/>
+    <w:lvl w:ilvl="0" w:tentative="1">
+      <w:start w:val="1"/>
+      <w:numFmt w:val="decimal"/>
+      <w:lvlText w:val="%1."/>
+      <w:lvlJc w:val="left"/>
+      <w:pPr>
+        <w:ind w:left="540" w:hanging="360"/>
+      </w:pPr>
+    </w:lvl>
+  </w:abstractNum>
   <w:num w:numId="1">
     <w:abstractNumId w:val="1"/>
     <w:lvlOverride w:ilvl="0">
@@ -3935,6 +4743,12 @@
   </w:num>
   <w:num w:numId="6">
     <w:abstractNumId w:val="6"/>
+    <w:lvlOverride w:ilvl="0">
+      <w:startOverride w:val="1"/>
+    </w:lvlOverride>
+  </w:num>
+  <w:num w:numId="7">
+    <w:abstractNumId w:val="7"/>
     <w:lvlOverride w:ilvl="0">
       <w:startOverride w:val="1"/>
     </w:lvlOverride>

</xml_diff>

<commit_message>
Operator guides: afternoon Enterprise demo (inbox, invoices, calls, cost), troubleshooting, glossary
Co-Authored-By: Claude Opus 5.5 <noreply@anthropic.com>
</commit_message>
<xml_diff>
--- a/docs/Huong-dan-Workshop-AI-DGX-Spark.docx
+++ b/docs/Huong-dan-Workshop-AI-DGX-Spark.docx
@@ -580,6 +580,81 @@
           </w:p>
         </w:tc>
       </w:tr>
+      <w:tr>
+        <w:tc>
+          <w:tcPr>
+            <w:tcW w:type="dxa" w:w="2500"/>
+            <w:tcBorders>
+              <w:top w:val="single" w:color="CBD5E1" w:sz="4"/>
+              <w:left w:val="single" w:color="CBD5E1" w:sz="4"/>
+              <w:bottom w:val="single" w:color="CBD5E1" w:sz="4"/>
+              <w:right w:val="single" w:color="CBD5E1" w:sz="4"/>
+            </w:tcBorders>
+            <w:tcMar>
+              <w:top w:type="dxa" w:w="90"/>
+              <w:left w:type="dxa" w:w="120"/>
+              <w:bottom w:type="dxa" w:w="90"/>
+              <w:right w:type="dxa" w:w="120"/>
+            </w:tcMar>
+            <w:vAlign w:val="center"/>
+          </w:tcPr>
+          <w:p>
+            <w:r>
+              <w:rPr>
+                <w:b/>
+                <w:bCs/>
+              </w:rPr>
+              <w:t xml:space="preserve">5 · Demo doanh nghiệp (buổi chiều)</w:t>
+            </w:r>
+          </w:p>
+        </w:tc>
+        <w:tc>
+          <w:tcPr>
+            <w:tcW w:type="dxa" w:w="3700"/>
+            <w:tcBorders>
+              <w:top w:val="single" w:color="CBD5E1" w:sz="4"/>
+              <w:left w:val="single" w:color="CBD5E1" w:sz="4"/>
+              <w:bottom w:val="single" w:color="CBD5E1" w:sz="4"/>
+              <w:right w:val="single" w:color="CBD5E1" w:sz="4"/>
+            </w:tcBorders>
+            <w:tcMar>
+              <w:top w:type="dxa" w:w="90"/>
+              <w:left w:type="dxa" w:w="120"/>
+              <w:bottom w:type="dxa" w:w="90"/>
+              <w:right w:type="dxa" w:w="120"/>
+            </w:tcMar>
+            <w:vAlign w:val="center"/>
+          </w:tcPr>
+          <w:p>
+            <w:r>
+              <w:t xml:space="preserve">AI xử lý hàng loạt: 2.400 tin nhắn khách hàng, 1.000 hóa đơn scan, 300 cuộc gọi ghi âm</w:t>
+            </w:r>
+          </w:p>
+        </w:tc>
+        <w:tc>
+          <w:tcPr>
+            <w:tcW w:type="dxa" w:w="2826"/>
+            <w:tcBorders>
+              <w:top w:val="single" w:color="CBD5E1" w:sz="4"/>
+              <w:left w:val="single" w:color="CBD5E1" w:sz="4"/>
+              <w:bottom w:val="single" w:color="CBD5E1" w:sz="4"/>
+              <w:right w:val="single" w:color="CBD5E1" w:sz="4"/>
+            </w:tcBorders>
+            <w:tcMar>
+              <w:top w:type="dxa" w:w="90"/>
+              <w:left w:type="dxa" w:w="120"/>
+              <w:bottom w:type="dxa" w:w="90"/>
+              <w:right w:type="dxa" w:w="120"/>
+            </w:tcMar>
+            <w:vAlign w:val="center"/>
+          </w:tcPr>
+          <w:p>
+            <w:r>
+              <w:t xml:space="preserve">Tốc độ, độ chính xác so với đáp án, tiền điện và chi phí so với API đám mây</w:t>
+            </w:r>
+          </w:p>
+        </w:tc>
+      </w:tr>
     </w:tbl>
     <w:p>
       <w:pPr>
@@ -718,7 +793,7 @@
           <w:b/>
           <w:bCs/>
         </w:rPr>
-        <w:t xml:space="preserve">100 GB</w:t>
+        <w:t xml:space="preserve">150 GB</w:t>
       </w:r>
       <w:r>
         <w:t xml:space="preserve"> dung lượng trống.</w:t>
@@ -741,7 +816,7 @@
           <w:b/>
           <w:bCs/>
         </w:rPr>
-        <w:t xml:space="preserve">1–2 giờ</w:t>
+        <w:t xml:space="preserve">2 giờ</w:t>
       </w:r>
       <w:r>
         <w:t xml:space="preserve"> cho lần cài đặt đầu tiên. Máy tự chạy, không cần ngồi canh. Nếu máy thiếu phần mềm nào (Docker, Python…), chương trình tự cài.</w:t>
@@ -1954,7 +2029,7 @@
           </w:tcPr>
           <w:p>
             <w:r>
-              <w:t xml:space="preserve">Tổng quan · 01 Tinh chỉnh · 02 RAG · 03 Agent · 04 OpenClaw · Thử thách</w:t>
+              <w:t xml:space="preserve">Tổng quan · Diễn giả · 01 Tinh chỉnh · 02 RAG · 03 Agent · 04 OpenClaw · Thử thách · 05 Doanh nghiệp</w:t>
             </w:r>
           </w:p>
         </w:tc>
@@ -2991,7 +3066,375 @@
         <w:pStyle w:val="Heading1"/>
       </w:pPr>
       <w:r>
-        <w:t xml:space="preserve">7. Phần E — Khi gặp sự cố</w:t>
+        <w:t xml:space="preserve">7. Phần E — Buổi chiều: demo doanh nghiệp (tab 05)</w:t>
+      </w:r>
+    </w:p>
+    <w:p>
+      <w:pPr>
+        <w:spacing w:after="120"/>
+      </w:pPr>
+      <w:r>
+        <w:t xml:space="preserve">Ba công việc mà doanh nghiệp đang trả tiền cho người làm hoặc cho API đám mây, chạy thành lô thật trên dữ liệu giả lập của chuỗi bán lẻ hư cấu Aurora Mart. Mỗi mục đều có đáp án, nên độ chính xác trên màn hình là số đo thật.</w:t>
+      </w:r>
+    </w:p>
+    <w:tbl>
+      <w:tblPr>
+        <w:tblW w:type="dxa" w:w="9026"/>
+        <w:tblBorders>
+          <w:top w:val="single" w:color="auto" w:sz="4"/>
+          <w:left w:val="single" w:color="auto" w:sz="4"/>
+          <w:bottom w:val="single" w:color="auto" w:sz="4"/>
+          <w:right w:val="single" w:color="auto" w:sz="4"/>
+          <w:insideH w:val="single" w:color="auto" w:sz="4"/>
+          <w:insideV w:val="single" w:color="auto" w:sz="4"/>
+        </w:tblBorders>
+      </w:tblPr>
+      <w:tblGrid>
+        <w:gridCol w:w="9026"/>
+      </w:tblGrid>
+      <w:tr>
+        <w:tc>
+          <w:tcPr>
+            <w:tcW w:type="dxa" w:w="9026"/>
+            <w:tcBorders>
+              <w:top w:val="single" w:color="FEF3E2" w:sz="4"/>
+              <w:left w:val="single" w:color="E0A95F" w:sz="24"/>
+              <w:bottom w:val="single" w:color="FEF3E2" w:sz="4"/>
+              <w:right w:val="single" w:color="FEF3E2" w:sz="4"/>
+            </w:tcBorders>
+            <w:shd w:fill="FEF3E2" w:color="auto" w:val="clear"/>
+            <w:tcMar>
+              <w:top w:type="dxa" w:w="120"/>
+              <w:left w:type="dxa" w:w="200"/>
+              <w:bottom w:type="dxa" w:w="100"/>
+              <w:right w:type="dxa" w:w="160"/>
+            </w:tcMar>
+          </w:tcPr>
+          <w:p>
+            <w:pPr>
+              <w:spacing w:after="60"/>
+            </w:pPr>
+            <w:r>
+              <w:rPr>
+                <w:b/>
+                <w:bCs/>
+                <w:color w:val="1F2937"/>
+              </w:rPr>
+              <w:t xml:space="preserve">TRƯỚC KHI KHÁN GIẢ VÀO  </w:t>
+            </w:r>
+            <w:r>
+              <w:t xml:space="preserve">Mở tab </w:t>
+            </w:r>
+            <w:r>
+              <w:rPr>
+                <w:b/>
+                <w:bCs/>
+              </w:rPr>
+              <w:t xml:space="preserve">05 Doanh nghiệp</w:t>
+            </w:r>
+            <w:r>
+              <w:t xml:space="preserve"> và bấm </w:t>
+            </w:r>
+            <w:r>
+              <w:rPr>
+                <w:b/>
+                <w:bCs/>
+              </w:rPr>
+              <w:t xml:space="preserve">Bật máy chủ</w:t>
+            </w:r>
+            <w:r>
+              <w:t xml:space="preserve">. Lần đầu máy chủ xử lý hàng loạt cần </w:t>
+            </w:r>
+            <w:r>
+              <w:rPr>
+                <w:b/>
+                <w:bCs/>
+              </w:rPr>
+              <w:t xml:space="preserve">2–4 phút</w:t>
+            </w:r>
+            <w:r>
+              <w:t xml:space="preserve"> để khởi động. Máy chủ tự tắt sau 30 phút không dùng để trả bộ nhớ cho các bài lab.</w:t>
+            </w:r>
+          </w:p>
+        </w:tc>
+      </w:tr>
+    </w:tbl>
+    <w:p>
+      <w:pPr>
+        <w:spacing w:after="120"/>
+      </w:pPr>
+    </w:p>
+    <w:p>
+      <w:pPr>
+        <w:pStyle w:val="ListParagraph"/>
+        <w:numPr>
+          <w:ilvl w:val="0"/>
+          <w:numId w:val="8"/>
+        </w:numPr>
+        <w:spacing w:after="100"/>
+      </w:pPr>
+      <w:r>
+        <w:t xml:space="preserve">Chọn </w:t>
+      </w:r>
+      <w:r>
+        <w:rPr>
+          <w:b/>
+          <w:bCs/>
+        </w:rPr>
+        <w:t xml:space="preserve">Phân loại hộp thư khách hàng</w:t>
+      </w:r>
+      <w:r>
+        <w:t xml:space="preserve"> (2.400 tin nhắn), bấm </w:t>
+      </w:r>
+      <w:r>
+        <w:rPr>
+          <w:b/>
+          <w:bCs/>
+        </w:rPr>
+        <w:t xml:space="preserve">Chạy 300 mục</w:t>
+      </w:r>
+      <w:r>
+        <w:t xml:space="preserve">: khoảng 180 tin nhắn mỗi phút. Chỉ vào độ chính xác và dòng </w:t>
+      </w:r>
+      <w:r>
+        <w:rPr>
+          <w:b/>
+          <w:bCs/>
+        </w:rPr>
+        <w:t xml:space="preserve">Bắt được …/… tin khẩn cấp</w:t>
+      </w:r>
+      <w:r>
+        <w:t xml:space="preserve">; bấm một dòng để xem tin nhắn, kết quả của AI, đáp án và bản nháp trả lời.</w:t>
+      </w:r>
+    </w:p>
+    <w:p>
+      <w:pPr>
+        <w:pStyle w:val="ListParagraph"/>
+        <w:numPr>
+          <w:ilvl w:val="0"/>
+          <w:numId w:val="8"/>
+        </w:numPr>
+        <w:spacing w:after="100"/>
+      </w:pPr>
+      <w:r>
+        <w:t xml:space="preserve">Chọn </w:t>
+      </w:r>
+      <w:r>
+        <w:rPr>
+          <w:b/>
+          <w:bCs/>
+        </w:rPr>
+        <w:t xml:space="preserve">Hóa đơn đầu vào sang Excel</w:t>
+      </w:r>
+      <w:r>
+        <w:t xml:space="preserve"> (1.000 hóa đơn scan), bấm </w:t>
+      </w:r>
+      <w:r>
+        <w:rPr>
+          <w:b/>
+          <w:bCs/>
+        </w:rPr>
+        <w:t xml:space="preserve">Chạy 100 mục</w:t>
+      </w:r>
+      <w:r>
+        <w:t xml:space="preserve">: khoảng 35 hóa đơn mỗi phút. Hóa đơn cộng sai, sai thuế hoặc bị trùng được đánh dấu </w:t>
+      </w:r>
+      <w:r>
+        <w:rPr>
+          <w:b/>
+          <w:bCs/>
+        </w:rPr>
+        <w:t xml:space="preserve">Cần kiểm tra</w:t>
+      </w:r>
+      <w:r>
+        <w:t xml:space="preserve">.</w:t>
+      </w:r>
+    </w:p>
+    <w:p>
+      <w:pPr>
+        <w:pStyle w:val="ListParagraph"/>
+        <w:numPr>
+          <w:ilvl w:val="0"/>
+          <w:numId w:val="8"/>
+        </w:numPr>
+        <w:spacing w:after="100"/>
+      </w:pPr>
+      <w:r>
+        <w:t xml:space="preserve">Chọn </w:t>
+      </w:r>
+      <w:r>
+        <w:rPr>
+          <w:b/>
+          <w:bCs/>
+        </w:rPr>
+        <w:t xml:space="preserve">Chấm điểm chất lượng cuộc gọi</w:t>
+      </w:r>
+      <w:r>
+        <w:t xml:space="preserve"> (300 cuộc gọi), bấm </w:t>
+      </w:r>
+      <w:r>
+        <w:rPr>
+          <w:b/>
+          <w:bCs/>
+        </w:rPr>
+        <w:t xml:space="preserve">Chạy 30 mục</w:t>
+      </w:r>
+      <w:r>
+        <w:t xml:space="preserve">: máy chuyển giọng nói thành văn bản rồi chấm theo checklist, khoảng 19 cuộc gọi mỗi phút. Bấm một dòng để nghe ghi âm và xem phiếu chấm.</w:t>
+      </w:r>
+    </w:p>
+    <w:p>
+      <w:pPr>
+        <w:pStyle w:val="ListParagraph"/>
+        <w:numPr>
+          <w:ilvl w:val="0"/>
+          <w:numId w:val="8"/>
+        </w:numPr>
+        <w:spacing w:after="100"/>
+      </w:pPr>
+      <w:r>
+        <w:t xml:space="preserve">Bấm </w:t>
+      </w:r>
+      <w:r>
+        <w:rPr>
+          <w:b/>
+          <w:bCs/>
+        </w:rPr>
+        <w:t xml:space="preserve">Tải Excel</w:t>
+      </w:r>
+      <w:r>
+        <w:t xml:space="preserve"> ở mỗi việc để mở kết quả trong Excel.</w:t>
+      </w:r>
+    </w:p>
+    <w:p>
+      <w:pPr>
+        <w:pStyle w:val="ListParagraph"/>
+        <w:numPr>
+          <w:ilvl w:val="0"/>
+          <w:numId w:val="8"/>
+        </w:numPr>
+        <w:spacing w:after="100"/>
+      </w:pPr>
+      <w:r>
+        <w:t xml:space="preserve">Kéo xuống </w:t>
+      </w:r>
+      <w:r>
+        <w:rPr>
+          <w:b/>
+          <w:bCs/>
+        </w:rPr>
+        <w:t xml:space="preserve">Chi phí</w:t>
+      </w:r>
+      <w:r>
+        <w:t xml:space="preserve">: nhập khối lượng mỗi tháng của khách. Dòng </w:t>
+      </w:r>
+      <w:r>
+        <w:rPr>
+          <w:b/>
+          <w:bCs/>
+        </w:rPr>
+        <w:t xml:space="preserve">Cả 3 việc mỗi tháng</w:t>
+      </w:r>
+      <w:r>
+        <w:t xml:space="preserve"> cho thấy sau bao lâu máy hoàn vốn so với API đám mây.</w:t>
+      </w:r>
+    </w:p>
+    <w:p>
+      <w:pPr>
+        <w:pStyle w:val="ListParagraph"/>
+        <w:numPr>
+          <w:ilvl w:val="0"/>
+          <w:numId w:val="8"/>
+        </w:numPr>
+        <w:spacing w:after="100"/>
+      </w:pPr>
+      <w:r>
+        <w:t xml:space="preserve">So sánh: chọn </w:t>
+      </w:r>
+      <w:r>
+        <w:rPr>
+          <w:b/>
+          <w:bCs/>
+        </w:rPr>
+        <w:t xml:space="preserve">Ollama · từng mục</w:t>
+      </w:r>
+      <w:r>
+        <w:t xml:space="preserve"> rồi chạy 20 tin nhắn — chậm hơn nhiều lần. Đây là lý do dùng máy chủ theo lô (vLLM) cho công việc hàng loạt.</w:t>
+      </w:r>
+    </w:p>
+    <w:tbl>
+      <w:tblPr>
+        <w:tblW w:type="dxa" w:w="9026"/>
+        <w:tblBorders>
+          <w:top w:val="single" w:color="auto" w:sz="4"/>
+          <w:left w:val="single" w:color="auto" w:sz="4"/>
+          <w:bottom w:val="single" w:color="auto" w:sz="4"/>
+          <w:right w:val="single" w:color="auto" w:sz="4"/>
+          <w:insideH w:val="single" w:color="auto" w:sz="4"/>
+          <w:insideV w:val="single" w:color="auto" w:sz="4"/>
+        </w:tblBorders>
+      </w:tblPr>
+      <w:tblGrid>
+        <w:gridCol w:w="9026"/>
+      </w:tblGrid>
+      <w:tr>
+        <w:tc>
+          <w:tcPr>
+            <w:tcW w:type="dxa" w:w="9026"/>
+            <w:tcBorders>
+              <w:top w:val="single" w:color="EEF7E4" w:sz="4"/>
+              <w:left w:val="single" w:color="76B900" w:sz="24"/>
+              <w:bottom w:val="single" w:color="EEF7E4" w:sz="4"/>
+              <w:right w:val="single" w:color="EEF7E4" w:sz="4"/>
+            </w:tcBorders>
+            <w:shd w:fill="EEF7E4" w:color="auto" w:val="clear"/>
+            <w:tcMar>
+              <w:top w:type="dxa" w:w="120"/>
+              <w:left w:type="dxa" w:w="200"/>
+              <w:bottom w:type="dxa" w:w="100"/>
+              <w:right w:type="dxa" w:w="160"/>
+            </w:tcMar>
+          </w:tcPr>
+          <w:p>
+            <w:pPr>
+              <w:spacing w:after="60"/>
+            </w:pPr>
+            <w:r>
+              <w:rPr>
+                <w:b/>
+                <w:bCs/>
+                <w:color w:val="1F2937"/>
+              </w:rPr>
+              <w:t xml:space="preserve">LÀM LẠI TỪ ĐẦU  </w:t>
+            </w:r>
+            <w:r>
+              <w:t xml:space="preserve">Bấm </w:t>
+            </w:r>
+            <w:r>
+              <w:rPr>
+                <w:b/>
+                <w:bCs/>
+              </w:rPr>
+              <w:t xml:space="preserve">Làm lại từ đầu</w:t>
+            </w:r>
+            <w:r>
+              <w:t xml:space="preserve"> ở mỗi việc để xóa kết quả và trình diễn lại. Dữ liệu mẫu không bị xóa.</w:t>
+            </w:r>
+          </w:p>
+        </w:tc>
+      </w:tr>
+    </w:tbl>
+    <w:p>
+      <w:pPr>
+        <w:spacing w:after="200"/>
+      </w:pPr>
+    </w:p>
+    <w:p>
+      <w:pPr>
+        <w:pStyle w:val="Heading1"/>
+      </w:pPr>
+      <w:r>
+        <w:t xml:space="preserve">8. Phần F — Khi gặp sự cố</w:t>
       </w:r>
     </w:p>
     <w:tbl>
@@ -3675,6 +4118,150 @@
           </w:tcPr>
           <w:p>
             <w:r>
+              <w:t xml:space="preserve">Tab 05: “Không khởi động được” máy chủ</w:t>
+            </w:r>
+          </w:p>
+        </w:tc>
+        <w:tc>
+          <w:tcPr>
+            <w:tcW w:type="dxa" w:w="5426"/>
+            <w:tcBorders>
+              <w:top w:val="single" w:color="CBD5E1" w:sz="4"/>
+              <w:left w:val="single" w:color="CBD5E1" w:sz="4"/>
+              <w:bottom w:val="single" w:color="CBD5E1" w:sz="4"/>
+              <w:right w:val="single" w:color="CBD5E1" w:sz="4"/>
+            </w:tcBorders>
+            <w:tcMar>
+              <w:top w:type="dxa" w:w="90"/>
+              <w:left w:type="dxa" w:w="120"/>
+              <w:bottom w:type="dxa" w:w="90"/>
+              <w:right w:type="dxa" w:w="120"/>
+            </w:tcMar>
+            <w:vAlign w:val="center"/>
+          </w:tcPr>
+          <w:p>
+            <w:r>
+              <w:t xml:space="preserve">Thường do thiếu bộ nhớ: đóng các bài lab đang chạy, chờ 1 phút rồi bấm Bật máy chủ</w:t>
+            </w:r>
+          </w:p>
+        </w:tc>
+      </w:tr>
+      <w:tr>
+        <w:tc>
+          <w:tcPr>
+            <w:tcW w:type="dxa" w:w="3600"/>
+            <w:tcBorders>
+              <w:top w:val="single" w:color="CBD5E1" w:sz="4"/>
+              <w:left w:val="single" w:color="CBD5E1" w:sz="4"/>
+              <w:bottom w:val="single" w:color="CBD5E1" w:sz="4"/>
+              <w:right w:val="single" w:color="CBD5E1" w:sz="4"/>
+            </w:tcBorders>
+            <w:tcMar>
+              <w:top w:type="dxa" w:w="90"/>
+              <w:left w:type="dxa" w:w="120"/>
+              <w:bottom w:type="dxa" w:w="90"/>
+              <w:right w:type="dxa" w:w="120"/>
+            </w:tcMar>
+            <w:vAlign w:val="center"/>
+          </w:tcPr>
+          <w:p>
+            <w:r>
+              <w:t xml:space="preserve">Tab 05 ghi “Chưa cài đặt”</w:t>
+            </w:r>
+          </w:p>
+        </w:tc>
+        <w:tc>
+          <w:tcPr>
+            <w:tcW w:type="dxa" w:w="5426"/>
+            <w:tcBorders>
+              <w:top w:val="single" w:color="CBD5E1" w:sz="4"/>
+              <w:left w:val="single" w:color="CBD5E1" w:sz="4"/>
+              <w:bottom w:val="single" w:color="CBD5E1" w:sz="4"/>
+              <w:right w:val="single" w:color="CBD5E1" w:sz="4"/>
+            </w:tcBorders>
+            <w:tcMar>
+              <w:top w:type="dxa" w:w="90"/>
+              <w:left w:type="dxa" w:w="120"/>
+              <w:bottom w:type="dxa" w:w="90"/>
+              <w:right w:type="dxa" w:w="120"/>
+            </w:tcMar>
+            <w:vAlign w:val="center"/>
+          </w:tcPr>
+          <w:p>
+            <w:r>
+              <w:t xml:space="preserve">Chạy lại lệnh cài đặt ở Phần A, Bước 2 (tải thêm khoảng 38 GB)</w:t>
+            </w:r>
+          </w:p>
+        </w:tc>
+      </w:tr>
+      <w:tr>
+        <w:tc>
+          <w:tcPr>
+            <w:tcW w:type="dxa" w:w="3600"/>
+            <w:tcBorders>
+              <w:top w:val="single" w:color="CBD5E1" w:sz="4"/>
+              <w:left w:val="single" w:color="CBD5E1" w:sz="4"/>
+              <w:bottom w:val="single" w:color="CBD5E1" w:sz="4"/>
+              <w:right w:val="single" w:color="CBD5E1" w:sz="4"/>
+            </w:tcBorders>
+            <w:tcMar>
+              <w:top w:type="dxa" w:w="90"/>
+              <w:left w:type="dxa" w:w="120"/>
+              <w:bottom w:type="dxa" w:w="90"/>
+              <w:right w:type="dxa" w:w="120"/>
+            </w:tcMar>
+            <w:vAlign w:val="center"/>
+          </w:tcPr>
+          <w:p>
+            <w:r>
+              <w:t xml:space="preserve">Lúc cài: “Docker is not running”</w:t>
+            </w:r>
+          </w:p>
+        </w:tc>
+        <w:tc>
+          <w:tcPr>
+            <w:tcW w:type="dxa" w:w="5426"/>
+            <w:tcBorders>
+              <w:top w:val="single" w:color="CBD5E1" w:sz="4"/>
+              <w:left w:val="single" w:color="CBD5E1" w:sz="4"/>
+              <w:bottom w:val="single" w:color="CBD5E1" w:sz="4"/>
+              <w:right w:val="single" w:color="CBD5E1" w:sz="4"/>
+            </w:tcBorders>
+            <w:tcMar>
+              <w:top w:type="dxa" w:w="90"/>
+              <w:left w:type="dxa" w:w="120"/>
+              <w:bottom w:type="dxa" w:w="90"/>
+              <w:right w:type="dxa" w:w="120"/>
+            </w:tcMar>
+            <w:vAlign w:val="center"/>
+          </w:tcPr>
+          <w:p>
+            <w:r>
+              <w:t xml:space="preserve">Đã được sửa trong bản mới: chạy lại lệnh cài đặt ở Phần A, Bước 2; chương trình tự cấp quyền Docker cho tài khoản</w:t>
+            </w:r>
+          </w:p>
+        </w:tc>
+      </w:tr>
+      <w:tr>
+        <w:tc>
+          <w:tcPr>
+            <w:tcW w:type="dxa" w:w="3600"/>
+            <w:tcBorders>
+              <w:top w:val="single" w:color="CBD5E1" w:sz="4"/>
+              <w:left w:val="single" w:color="CBD5E1" w:sz="4"/>
+              <w:bottom w:val="single" w:color="CBD5E1" w:sz="4"/>
+              <w:right w:val="single" w:color="CBD5E1" w:sz="4"/>
+            </w:tcBorders>
+            <w:tcMar>
+              <w:top w:type="dxa" w:w="90"/>
+              <w:left w:type="dxa" w:w="120"/>
+              <w:bottom w:type="dxa" w:w="90"/>
+              <w:right w:type="dxa" w:w="120"/>
+            </w:tcMar>
+            <w:vAlign w:val="center"/>
+          </w:tcPr>
+          <w:p>
+            <w:r>
               <w:t xml:space="preserve">Vẫn không được</w:t>
             </w:r>
           </w:p>
@@ -3724,7 +4311,7 @@
         <w:pStyle w:val="Heading1"/>
       </w:pPr>
       <w:r>
-        <w:t xml:space="preserve">8. Phần F — Giải thích thuật ngữ</w:t>
+        <w:t xml:space="preserve">9. Phần G — Giải thích thuật ngữ</w:t>
       </w:r>
     </w:p>
     <w:tbl>
@@ -3986,7 +4573,7 @@
                 <w:b/>
                 <w:bCs/>
               </w:rPr>
-              <w:t xml:space="preserve">NemoClaw</w:t>
+              <w:t xml:space="preserve">vLLM</w:t>
             </w:r>
           </w:p>
         </w:tc>
@@ -4009,7 +4596,7 @@
           </w:tcPr>
           <w:p>
             <w:r>
-              <w:t xml:space="preserve">Bộ công cụ của NVIDIA để chạy agent AI an toàn. Agent được đặt trong một “sandbox”: một căn phòng kín, chỉ làm được những việc được cho phép.</w:t>
+              <w:t xml:space="preserve">Máy chủ chạy mô hình AI theo lô: xử lý hàng chục yêu cầu cùng lúc, dùng cho các công việc hàng loạt ở tab 05.</w:t>
             </w:r>
           </w:p>
         </w:tc>
@@ -4038,7 +4625,7 @@
                 <w:b/>
                 <w:bCs/>
               </w:rPr>
-              <w:t xml:space="preserve">Tinh chỉnh (Fine-tuning)</w:t>
+              <w:t xml:space="preserve">NVFP4</w:t>
             </w:r>
           </w:p>
         </w:tc>
@@ -4061,7 +4648,7 @@
           </w:tcPr>
           <w:p>
             <w:r>
-              <w:t xml:space="preserve">Dạy thêm cho mô hình có sẵn bằng ví dụ để nó đổi cách cư xử. LoRA là cách tinh chỉnh nhanh: chỉ học thêm một phần rất nhỏ.</w:t>
+              <w:t xml:space="preserve">Cách lưu mô hình bằng số 4-bit của chip Blackwell: mô hình nhỏ hơn, chạy nhanh hơn mà vẫn chính xác.</w:t>
             </w:r>
           </w:p>
         </w:tc>
@@ -4090,7 +4677,7 @@
                 <w:b/>
                 <w:bCs/>
               </w:rPr>
-              <w:t xml:space="preserve">RAG</w:t>
+              <w:t xml:space="preserve">Chuyển giọng nói thành văn bản</w:t>
             </w:r>
           </w:p>
         </w:tc>
@@ -4113,7 +4700,7 @@
           </w:tcPr>
           <w:p>
             <w:r>
-              <w:t xml:space="preserve">Cho AI tra cứu tài liệu trước khi trả lời, để câu trả lời đúng theo tài liệu và có nguồn.</w:t>
+              <w:t xml:space="preserve">AI nghe ghi âm và chép lại lời nói (ở đây dùng PhoWhisper của VinAI cho tiếng Việt).</w:t>
             </w:r>
           </w:p>
         </w:tc>
@@ -4142,7 +4729,7 @@
                 <w:b/>
                 <w:bCs/>
               </w:rPr>
-              <w:t xml:space="preserve">Agent</w:t>
+              <w:t xml:space="preserve">NemoClaw</w:t>
             </w:r>
           </w:p>
         </w:tc>
@@ -4165,7 +4752,7 @@
           </w:tcPr>
           <w:p>
             <w:r>
-              <w:t xml:space="preserve">AI không chỉ trả lời mà còn tự quyết định dùng công cụ nào (đọc Excel, tính toán, vẽ biểu đồ) để hoàn thành việc được giao.</w:t>
+              <w:t xml:space="preserve">Bộ công cụ của NVIDIA để chạy agent AI an toàn. Agent được đặt trong một “sandbox”: một căn phòng kín, chỉ làm được những việc được cho phép.</w:t>
             </w:r>
           </w:p>
         </w:tc>
@@ -4194,7 +4781,7 @@
                 <w:b/>
                 <w:bCs/>
               </w:rPr>
-              <w:t xml:space="preserve">OpenClaw</w:t>
+              <w:t xml:space="preserve">Tinh chỉnh (Fine-tuning)</w:t>
             </w:r>
           </w:p>
         </w:tc>
@@ -4217,7 +4804,7 @@
           </w:tcPr>
           <w:p>
             <w:r>
-              <w:t xml:space="preserve">Agent AI có giao diện chat riêng, chạy trong sandbox NemoClaw. Dùng trong phần thử thách.</w:t>
+              <w:t xml:space="preserve">Dạy thêm cho mô hình có sẵn bằng ví dụ để nó đổi cách cư xử. LoRA là cách tinh chỉnh nhanh: chỉ học thêm một phần rất nhỏ.</w:t>
             </w:r>
           </w:p>
         </w:tc>
@@ -4246,6 +4833,162 @@
                 <w:b/>
                 <w:bCs/>
               </w:rPr>
+              <w:t xml:space="preserve">RAG</w:t>
+            </w:r>
+          </w:p>
+        </w:tc>
+        <w:tc>
+          <w:tcPr>
+            <w:tcW w:type="dxa" w:w="6426"/>
+            <w:tcBorders>
+              <w:top w:val="single" w:color="CBD5E1" w:sz="4"/>
+              <w:left w:val="single" w:color="CBD5E1" w:sz="4"/>
+              <w:bottom w:val="single" w:color="CBD5E1" w:sz="4"/>
+              <w:right w:val="single" w:color="CBD5E1" w:sz="4"/>
+            </w:tcBorders>
+            <w:tcMar>
+              <w:top w:type="dxa" w:w="90"/>
+              <w:left w:type="dxa" w:w="120"/>
+              <w:bottom w:type="dxa" w:w="90"/>
+              <w:right w:type="dxa" w:w="120"/>
+            </w:tcMar>
+            <w:vAlign w:val="center"/>
+          </w:tcPr>
+          <w:p>
+            <w:r>
+              <w:t xml:space="preserve">Cho AI tra cứu tài liệu trước khi trả lời, để câu trả lời đúng theo tài liệu và có nguồn.</w:t>
+            </w:r>
+          </w:p>
+        </w:tc>
+      </w:tr>
+      <w:tr>
+        <w:tc>
+          <w:tcPr>
+            <w:tcW w:type="dxa" w:w="2600"/>
+            <w:tcBorders>
+              <w:top w:val="single" w:color="CBD5E1" w:sz="4"/>
+              <w:left w:val="single" w:color="CBD5E1" w:sz="4"/>
+              <w:bottom w:val="single" w:color="CBD5E1" w:sz="4"/>
+              <w:right w:val="single" w:color="CBD5E1" w:sz="4"/>
+            </w:tcBorders>
+            <w:tcMar>
+              <w:top w:type="dxa" w:w="90"/>
+              <w:left w:type="dxa" w:w="120"/>
+              <w:bottom w:type="dxa" w:w="90"/>
+              <w:right w:type="dxa" w:w="120"/>
+            </w:tcMar>
+            <w:vAlign w:val="center"/>
+          </w:tcPr>
+          <w:p>
+            <w:r>
+              <w:rPr>
+                <w:b/>
+                <w:bCs/>
+              </w:rPr>
+              <w:t xml:space="preserve">Agent</w:t>
+            </w:r>
+          </w:p>
+        </w:tc>
+        <w:tc>
+          <w:tcPr>
+            <w:tcW w:type="dxa" w:w="6426"/>
+            <w:tcBorders>
+              <w:top w:val="single" w:color="CBD5E1" w:sz="4"/>
+              <w:left w:val="single" w:color="CBD5E1" w:sz="4"/>
+              <w:bottom w:val="single" w:color="CBD5E1" w:sz="4"/>
+              <w:right w:val="single" w:color="CBD5E1" w:sz="4"/>
+            </w:tcBorders>
+            <w:tcMar>
+              <w:top w:type="dxa" w:w="90"/>
+              <w:left w:type="dxa" w:w="120"/>
+              <w:bottom w:type="dxa" w:w="90"/>
+              <w:right w:type="dxa" w:w="120"/>
+            </w:tcMar>
+            <w:vAlign w:val="center"/>
+          </w:tcPr>
+          <w:p>
+            <w:r>
+              <w:t xml:space="preserve">AI không chỉ trả lời mà còn tự quyết định dùng công cụ nào (đọc Excel, tính toán, vẽ biểu đồ) để hoàn thành việc được giao.</w:t>
+            </w:r>
+          </w:p>
+        </w:tc>
+      </w:tr>
+      <w:tr>
+        <w:tc>
+          <w:tcPr>
+            <w:tcW w:type="dxa" w:w="2600"/>
+            <w:tcBorders>
+              <w:top w:val="single" w:color="CBD5E1" w:sz="4"/>
+              <w:left w:val="single" w:color="CBD5E1" w:sz="4"/>
+              <w:bottom w:val="single" w:color="CBD5E1" w:sz="4"/>
+              <w:right w:val="single" w:color="CBD5E1" w:sz="4"/>
+            </w:tcBorders>
+            <w:tcMar>
+              <w:top w:type="dxa" w:w="90"/>
+              <w:left w:type="dxa" w:w="120"/>
+              <w:bottom w:type="dxa" w:w="90"/>
+              <w:right w:type="dxa" w:w="120"/>
+            </w:tcMar>
+            <w:vAlign w:val="center"/>
+          </w:tcPr>
+          <w:p>
+            <w:r>
+              <w:rPr>
+                <w:b/>
+                <w:bCs/>
+              </w:rPr>
+              <w:t xml:space="preserve">OpenClaw</w:t>
+            </w:r>
+          </w:p>
+        </w:tc>
+        <w:tc>
+          <w:tcPr>
+            <w:tcW w:type="dxa" w:w="6426"/>
+            <w:tcBorders>
+              <w:top w:val="single" w:color="CBD5E1" w:sz="4"/>
+              <w:left w:val="single" w:color="CBD5E1" w:sz="4"/>
+              <w:bottom w:val="single" w:color="CBD5E1" w:sz="4"/>
+              <w:right w:val="single" w:color="CBD5E1" w:sz="4"/>
+            </w:tcBorders>
+            <w:tcMar>
+              <w:top w:type="dxa" w:w="90"/>
+              <w:left w:type="dxa" w:w="120"/>
+              <w:bottom w:type="dxa" w:w="90"/>
+              <w:right w:type="dxa" w:w="120"/>
+            </w:tcMar>
+            <w:vAlign w:val="center"/>
+          </w:tcPr>
+          <w:p>
+            <w:r>
+              <w:t xml:space="preserve">Agent AI có giao diện chat riêng, chạy trong sandbox NemoClaw. Dùng trong phần thử thách.</w:t>
+            </w:r>
+          </w:p>
+        </w:tc>
+      </w:tr>
+      <w:tr>
+        <w:tc>
+          <w:tcPr>
+            <w:tcW w:type="dxa" w:w="2600"/>
+            <w:tcBorders>
+              <w:top w:val="single" w:color="CBD5E1" w:sz="4"/>
+              <w:left w:val="single" w:color="CBD5E1" w:sz="4"/>
+              <w:bottom w:val="single" w:color="CBD5E1" w:sz="4"/>
+              <w:right w:val="single" w:color="CBD5E1" w:sz="4"/>
+            </w:tcBorders>
+            <w:tcMar>
+              <w:top w:type="dxa" w:w="90"/>
+              <w:left w:type="dxa" w:w="120"/>
+              <w:bottom w:type="dxa" w:w="90"/>
+              <w:right w:type="dxa" w:w="120"/>
+            </w:tcMar>
+            <w:vAlign w:val="center"/>
+          </w:tcPr>
+          <w:p>
+            <w:r>
+              <w:rPr>
+                <w:b/>
+                <w:bCs/>
+              </w:rPr>
               <w:t xml:space="preserve">Skill</w:t>
             </w:r>
           </w:p>
@@ -4285,7 +5028,7 @@
         <w:pStyle w:val="Heading1"/>
       </w:pPr>
       <w:r>
-        <w:t xml:space="preserve">9. Phụ lục — Trình chiếu từ laptop (cho người có kinh nghiệm)</w:t>
+        <w:t xml:space="preserve">10. Phụ lục — Trình chiếu từ laptop (cho người có kinh nghiệm)</w:t>
       </w:r>
     </w:p>
     <w:p>
@@ -4711,6 +5454,18 @@
       </w:pPr>
     </w:lvl>
   </w:abstractNum>
+  <w:abstractNum w:abstractNumId="8" w15:restartNumberingAfterBreak="0">
+    <w:multiLevelType w:val="hybridMultilevel"/>
+    <w:lvl w:ilvl="0" w:tentative="1">
+      <w:start w:val="1"/>
+      <w:numFmt w:val="decimal"/>
+      <w:lvlText w:val="%1."/>
+      <w:lvlJc w:val="left"/>
+      <w:pPr>
+        <w:ind w:left="540" w:hanging="360"/>
+      </w:pPr>
+    </w:lvl>
+  </w:abstractNum>
   <w:num w:numId="1">
     <w:abstractNumId w:val="1"/>
     <w:lvlOverride w:ilvl="0">
@@ -4749,6 +5504,12 @@
   </w:num>
   <w:num w:numId="7">
     <w:abstractNumId w:val="7"/>
+    <w:lvlOverride w:ilvl="0">
+      <w:startOverride w:val="1"/>
+    </w:lvlOverride>
+  </w:num>
+  <w:num w:numId="8">
+    <w:abstractNumId w:val="8"/>
     <w:lvlOverride w:ilvl="0">
       <w:startOverride w:val="1"/>
     </w:lvlOverride>

</xml_diff>